<commit_message>
docs: Spring Retrospective 5
</commit_message>
<xml_diff>
--- a/documentation/Sprint Retrospective4.docx
+++ b/documentation/Sprint Retrospective4.docx
@@ -455,7 +455,7 @@
           <w:rFonts w:ascii="Cascadia Mono" w:hAnsi="Cascadia Mono"/>
         </w:rPr>
         <w:pict>
-          <v:rect id="_x0000_i1028" style="width:0;height:1.5pt" o:hralign="center" o:hrstd="t" o:hr="t" fillcolor="#a0a0a0" stroked="f"/>
+          <v:rect id="_x0000_i1038" style="width:0;height:1.5pt" o:hralign="center" o:hrstd="t" o:hr="t" fillcolor="#a0a0a0" stroked="f"/>
         </w:pict>
       </w:r>
     </w:p>
@@ -511,7 +511,7 @@
       </w:pPr>
       <w:r>
         <w:pict>
-          <v:rect id="_x0000_i1037" style="width:426.8pt;height:.05pt" o:hrpct="988" o:hralign="center" o:hrstd="t" o:hr="t" fillcolor="#a0a0a0" stroked="f"/>
+          <v:rect id="_x0000_i1029" style="width:426.8pt;height:.05pt" o:hrpct="988" o:hralign="center" o:hrstd="t" o:hr="t" fillcolor="#a0a0a0" stroked="f"/>
         </w:pict>
       </w:r>
     </w:p>

</xml_diff>